<commit_message>
feat(export): unidad en Finding y nombres de marca en Proposal
contract-change aditivo en schemas.py: Finding.unidad (por defecto fraccion) y
Proposal.marcas (id -> nombre, por defecto vacío). Las reglas de findings.py
declaran su unidad y el exportador formatea con ella.

Co-Authored-By: Claude Opus 5.5 <noreply@anthropic.com>
</commit_message>
<xml_diff>
--- a/docs/ejemplos/propuesta_alborada_ejemplo.docx
+++ b/docs/ejemplos/propuesta_alborada_ejemplo.docx
@@ -2438,7 +2438,7 @@
           </w:tcPr>
           <w:p>
             <w:r>
-              <w:t xml:space="preserve">Instituto Oftalmico Tramuntana</w:t>
+              <w:t xml:space="preserve">Instituto Oftálmico Tramuntana</w:t>
             </w:r>
           </w:p>
         </w:tc>
@@ -2522,7 +2522,7 @@
           </w:tcPr>
           <w:p>
             <w:r>
-              <w:t xml:space="preserve">Laser Nitida</w:t>
+              <w:t xml:space="preserve">Láser Nítida</w:t>
             </w:r>
           </w:p>
         </w:tc>
@@ -2564,7 +2564,7 @@
           </w:tcPr>
           <w:p>
             <w:r>
-              <w:t xml:space="preserve">Clinica Del Ojo Cervantes</w:t>
+              <w:t xml:space="preserve">Clínica del Ojo Cervantes</w:t>
             </w:r>
           </w:p>
         </w:tc>
@@ -2648,7 +2648,7 @@
           </w:tcPr>
           <w:p>
             <w:r>
-              <w:t xml:space="preserve">Vistalia Oftalmologia</w:t>
+              <w:t xml:space="preserve">Vistalia Oftalmología</w:t>
             </w:r>
           </w:p>
         </w:tc>
@@ -2732,7 +2732,7 @@
           </w:tcPr>
           <w:p>
             <w:r>
-              <w:t xml:space="preserve">Visionar Clinicas</w:t>
+              <w:t xml:space="preserve">Visionar Clínicas</w:t>
             </w:r>
           </w:p>
         </w:tc>
@@ -2774,7 +2774,7 @@
           </w:tcPr>
           <w:p>
             <w:r>
-              <w:t xml:space="preserve">Centro Lasik Peninsula</w:t>
+              <w:t xml:space="preserve">Centro Lasik Península</w:t>
             </w:r>
           </w:p>
         </w:tc>
@@ -4423,7 +4423,7 @@
           </w:tcPr>
           <w:p>
             <w:r>
-              <w:t xml:space="preserve">0,15</w:t>
+              <w:t xml:space="preserve">15,0 %</w:t>
             </w:r>
           </w:p>
         </w:tc>
@@ -4580,7 +4580,7 @@
           </w:tcPr>
           <w:p>
             <w:r>
-              <w:t xml:space="preserve">0,0417</w:t>
+              <w:t xml:space="preserve">4,2 %</w:t>
             </w:r>
           </w:p>
         </w:tc>
@@ -4737,7 +4737,7 @@
           </w:tcPr>
           <w:p>
             <w:r>
-              <w:t xml:space="preserve">40,53</w:t>
+              <w:t xml:space="preserve">40,53 puntos</w:t>
             </w:r>
           </w:p>
         </w:tc>
@@ -4894,7 +4894,7 @@
           </w:tcPr>
           <w:p>
             <w:r>
-              <w:t xml:space="preserve">0,197</w:t>
+              <w:t xml:space="preserve">19,7 %</w:t>
             </w:r>
           </w:p>
         </w:tc>
@@ -5208,7 +5208,7 @@
           </w:tcPr>
           <w:p>
             <w:r>
-              <w:t xml:space="preserve">0,6125</w:t>
+              <w:t xml:space="preserve">61,3 %</w:t>
             </w:r>
           </w:p>
         </w:tc>
@@ -5365,7 +5365,7 @@
           </w:tcPr>
           <w:p>
             <w:r>
-              <w:t xml:space="preserve">1,011</w:t>
+              <w:t xml:space="preserve">1,01 puntos</w:t>
             </w:r>
           </w:p>
         </w:tc>

</xml_diff>

<commit_message>
docs(E): entregable de arquitectura, deck de 10 slides, revisión de Word y CODEOWNERS
Rebasado sobre develop (1798244). Arquitectura y deck al día: capa
determinista/no determinista (ADR 0014), rigor 25,9 [21,6–30,1],
seguimiento con método (ADR 0016), cuentas (ADR 0015), coste por
medición estimado (coste real PENDIENTE) y cifras de los golden
(25,93; 8.ª de 10; 25,9 → 30,8). Word de ejemplo regenerado con el
test de exportación (11 secciones). CODEOWNERS con los handles reales.

Co-Authored-By: Claude Opus 5.5 <noreply@anthropic.com>
</commit_message>
<xml_diff>
--- a/docs/ejemplos/propuesta_alborada_ejemplo.docx
+++ b/docs/ejemplos/propuesta_alborada_ejemplo.docx
@@ -38,12 +38,17 @@
     </w:p>
     <w:p>
       <w:r>
-        <w:t xml:space="preserve">Alborada aparece poco cuando nadie la nombra.</w:t>
+        <w:t xml:space="preserve">Clínica Alborada Visión cuenta con un sólido reconocimiento asistido en los asistentes de IA analizados, alcanzando una presencia del 100 % cuando los usuarios consultan directamente por la marca.</w:t>
       </w:r>
     </w:p>
     <w:p>
       <w:r>
-        <w:t xml:space="preserve">Proponemos un plan por fases.</w:t>
+        <w:t xml:space="preserve">Sin embargo, ante consultas abiertas y espontáneas sobre cirugía refractiva y control de miopía infantil, la recomendación desciende significativamente, situándose por detrás del líder del sector (Grupo Hospitalario Valdecruz).</w:t>
+      </w:r>
+    </w:p>
+    <w:p>
+      <w:r>
+        <w:t xml:space="preserve">Se propone un plan estratégico por fases orientado a reforzar la presencia en fuentes sanitarias de referencia, generar contenido especializado para momentos de decisión y recuperar visibilidad en Barcelona, respetando escrupulosamente la normativa de publicidad sanitaria y los recursos del equipo.</w:t>
       </w:r>
     </w:p>
     <w:p>
@@ -1166,7 +1171,7 @@
         <w:pStyle w:val="ListBullet"/>
       </w:pPr>
       <w:r>
-        <w:t xml:space="preserve">Datos sintéticos del kit</w:t>
+        <w:t xml:space="preserve">Datos sintéticos del kit del reto: reproducen con fidelidad la estructura de un estudio GEO, pero no reflejan cuotas reales de mercado.</w:t>
       </w:r>
     </w:p>
     <w:p>
@@ -1174,7 +1179,7 @@
         <w:pStyle w:val="ListBullet"/>
       </w:pPr>
       <w:r>
-        <w:t xml:space="preserve">Los motores no son deterministas</w:t>
+        <w:t xml:space="preserve">Naturaleza probabilística de los modelos de lenguaje: las respuestas varían en el tiempo y requieren seguimiento periódico.</w:t>
       </w:r>
     </w:p>
     <w:p>
@@ -1182,7 +1187,7 @@
         <w:pStyle w:val="ListBullet"/>
       </w:pPr>
       <w:r>
-        <w:t xml:space="preserve">No se garantizan resultados</w:t>
+        <w:t xml:space="preserve">Publicidad sanitaria regulada (RD 1907/1996): el plan no promete resultados ni hace comparativas denigratorias, y cada contenido necesita revisión médica y jurídica de la clínica antes de publicarse. Las mejoras de visibilidad son hipótesis técnicas y no garantizan resultados clínicos ni comerciales.</w:t>
       </w:r>
     </w:p>
     <w:p>
@@ -1195,7 +1200,7 @@
     </w:p>
     <w:p>
       <w:r>
-        <w:t xml:space="preserve">Diagnóstico sobre la visibilidad espontánea.</w:t>
+        <w:t xml:space="preserve">Diagnóstico detallado sobre la visibilidad espontánea y asistida por motor, fase del embudo y ciudad.</w:t>
       </w:r>
     </w:p>
     <w:tbl>
@@ -3247,7 +3252,7 @@
     </w:p>
     <w:p>
       <w:r>
-        <w:t xml:space="preserve">El líder concentra las recomendaciones.</w:t>
+        <w:t xml:space="preserve">Análisis comparativo de posicionamiento y brecha de fuentes frente al líder del mercado y competidores.</w:t>
       </w:r>
     </w:p>
     <w:p>
@@ -6425,7 +6430,7 @@
     </w:p>
     <w:p>
       <w:r>
-        <w:t xml:space="preserve">Ganar recomendación espontánea en Madrid y Barcelona.</w:t>
+        <w:t xml:space="preserve">Estrategia orientada a consolidar la prescripción espontánea en Madrid y Barcelona, impulsando la autoridad en fuentes médicas clave.</w:t>
       </w:r>
     </w:p>
     <w:p>
@@ -7307,7 +7312,7 @@
           </w:tcPr>
           <w:p>
             <w:r>
-              <w:t xml:space="preserve">Cambios de modelo</w:t>
+              <w:t xml:space="preserve">Variabilidad de fuentes y modelos de IA</w:t>
             </w:r>
           </w:p>
         </w:tc>
@@ -7317,7 +7322,29 @@
           </w:tcPr>
           <w:p>
             <w:r>
-              <w:t xml:space="preserve">Re-medición periódica</w:t>
+              <w:t xml:space="preserve">Protocolo de re-medición periódica para monitorizar cambios algorítmicos</w:t>
+            </w:r>
+          </w:p>
+        </w:tc>
+      </w:tr>
+      <w:tr>
+        <w:tc>
+          <w:tcPr>
+            <w:tcW w:type="dxa" w:w="4320"/>
+          </w:tcPr>
+          <w:p>
+            <w:r>
+              <w:t xml:space="preserve">Marco regulatorio en publicidad sanitaria</w:t>
+            </w:r>
+          </w:p>
+        </w:tc>
+        <w:tc>
+          <w:tcPr>
+            <w:tcW w:type="dxa" w:w="4320"/>
+          </w:tcPr>
+          <w:p>
+            <w:r>
+              <w:t xml:space="preserve">Revisión médica previa de todo contenido divulgativo sin promesas de resultados</w:t>
             </w:r>
           </w:p>
         </w:tc>
@@ -7531,7 +7558,7 @@
           </w:tcPr>
           <w:p>
             <w:r>
-              <w:t xml:space="preserve">Comité mensual</w:t>
+              <w:t xml:space="preserve">Comité mensual de seguimiento y presentación de informe evolutivo al comité de dirección</w:t>
             </w:r>
           </w:p>
         </w:tc>

</xml_diff>

<commit_message>
feat(write): encargo del brief y su cobertura en la propuesta y el Word
El nodo write usa write.v2: el redactor enlaza cada punto del brief con
acciones o hallazgos y domain.brief_coverage decide la cobertura. Reintenta
una vez si falta algo y lo declara en contexto.limitaciones si persiste.
El Word abre con «2. Lo que nos habéis pedido» y el fixture cubre los 16
puntos de Alborada.

Co-Authored-By: Claude Opus 5.5 <noreply@anthropic.com>
</commit_message>
<xml_diff>
--- a/docs/ejemplos/propuesta_alborada_ejemplo.docx
+++ b/docs/ejemplos/propuesta_alborada_ejemplo.docx
@@ -51,7 +51,940 @@
         <w:pStyle w:val="Heading1"/>
       </w:pPr>
       <w:r>
-        <w:t>2. Contexto y alcance</w:t>
+        <w:t>2. Lo que nos habéis pedido</w:t>
+      </w:r>
+    </w:p>
+    <w:p>
+      <w:r>
+        <w:t xml:space="preserve">Esto es lo que nos pedisteis en el brief, tal cual, y dónde lo trata esta propuesta. La cobertura la comprueba el sistema contra el plan y los hallazgos, no la redacción.</w:t>
+      </w:r>
+    </w:p>
+    <w:p>
+      <w:pPr>
+        <w:pStyle w:val="Heading2"/>
+      </w:pPr>
+      <w:r>
+        <w:t xml:space="preserve">Objetivos</w:t>
+      </w:r>
+    </w:p>
+    <w:p>
+      <w:pPr>
+        <w:pStyle w:val="ListBullet"/>
+      </w:pPr>
+      <w:r>
+        <w:t xml:space="preserve">Recomendación espontánea en asistentes de IA en Madrid y Barcelona</w:t>
+      </w:r>
+    </w:p>
+    <w:p>
+      <w:pPr>
+        <w:pStyle w:val="ListBullet"/>
+      </w:pPr>
+      <w:r>
+        <w:t xml:space="preserve">+25 % de primeras visitas de cirugía refractiva en 12 meses</w:t>
+      </w:r>
+    </w:p>
+    <w:p>
+      <w:pPr>
+        <w:pStyle w:val="Heading2"/>
+      </w:pPr>
+      <w:r>
+        <w:t xml:space="preserve">Restricciones</w:t>
+      </w:r>
+    </w:p>
+    <w:p>
+      <w:pPr>
+        <w:pStyle w:val="ListBullet"/>
+      </w:pPr>
+      <w:r>
+        <w:t xml:space="preserve">Publicidad sanitaria regulada: no prometer resultados</w:t>
+      </w:r>
+    </w:p>
+    <w:p>
+      <w:pPr>
+        <w:pStyle w:val="ListBullet"/>
+      </w:pPr>
+      <w:r>
+        <w:t xml:space="preserve">Sin comparativas denigratorias</w:t>
+      </w:r>
+    </w:p>
+    <w:p>
+      <w:pPr>
+        <w:pStyle w:val="Heading2"/>
+      </w:pPr>
+      <w:r>
+        <w:t xml:space="preserve">Servicios prioritarios</w:t>
+      </w:r>
+    </w:p>
+    <w:p>
+      <w:pPr>
+        <w:pStyle w:val="ListBullet"/>
+      </w:pPr>
+      <w:r>
+        <w:t xml:space="preserve">Cirugía refractiva</w:t>
+      </w:r>
+    </w:p>
+    <w:p>
+      <w:pPr>
+        <w:pStyle w:val="ListBullet"/>
+      </w:pPr>
+      <w:r>
+        <w:t xml:space="preserve">Control de miopía infantil</w:t>
+      </w:r>
+    </w:p>
+    <w:p>
+      <w:pPr>
+        <w:pStyle w:val="Heading2"/>
+      </w:pPr>
+      <w:r>
+        <w:t xml:space="preserve">Ciudades</w:t>
+      </w:r>
+    </w:p>
+    <w:p>
+      <w:pPr>
+        <w:pStyle w:val="ListBullet"/>
+      </w:pPr>
+      <w:r>
+        <w:t xml:space="preserve">Madrid</w:t>
+      </w:r>
+    </w:p>
+    <w:p>
+      <w:pPr>
+        <w:pStyle w:val="ListBullet"/>
+      </w:pPr>
+      <w:r>
+        <w:t xml:space="preserve">Barcelona</w:t>
+      </w:r>
+    </w:p>
+    <w:p>
+      <w:pPr>
+        <w:pStyle w:val="Heading2"/>
+      </w:pPr>
+      <w:r>
+        <w:t xml:space="preserve">Públicos</w:t>
+      </w:r>
+    </w:p>
+    <w:p>
+      <w:pPr>
+        <w:pStyle w:val="ListBullet"/>
+      </w:pPr>
+      <w:r>
+        <w:t xml:space="preserve">Adultos de 25 a 50 años con miopía o astigmatismo</w:t>
+      </w:r>
+    </w:p>
+    <w:p>
+      <w:pPr>
+        <w:pStyle w:val="ListBullet"/>
+      </w:pPr>
+      <w:r>
+        <w:t xml:space="preserve">Mayores de 60 años con cataratas y sus hijos</w:t>
+      </w:r>
+    </w:p>
+    <w:p>
+      <w:pPr>
+        <w:pStyle w:val="ListBullet"/>
+      </w:pPr>
+      <w:r>
+        <w:t xml:space="preserve">Padres de niños con miopía progresiva</w:t>
+      </w:r>
+    </w:p>
+    <w:p>
+      <w:pPr>
+        <w:pStyle w:val="ListBullet"/>
+      </w:pPr>
+      <w:r>
+        <w:t xml:space="preserve">Profesionales con requisitos específicos (pilotos)</w:t>
+      </w:r>
+    </w:p>
+    <w:p>
+      <w:pPr>
+        <w:pStyle w:val="Heading2"/>
+      </w:pPr>
+      <w:r>
+        <w:t xml:space="preserve">Competidores declarados</w:t>
+      </w:r>
+    </w:p>
+    <w:p>
+      <w:pPr>
+        <w:pStyle w:val="ListBullet"/>
+      </w:pPr>
+      <w:r>
+        <w:t xml:space="preserve">Instituto Oftálmico Tramuntana</w:t>
+      </w:r>
+    </w:p>
+    <w:p>
+      <w:pPr>
+        <w:pStyle w:val="ListBullet"/>
+      </w:pPr>
+      <w:r>
+        <w:t xml:space="preserve">Láser Nítida</w:t>
+      </w:r>
+    </w:p>
+    <w:p>
+      <w:pPr>
+        <w:pStyle w:val="ListBullet"/>
+      </w:pPr>
+      <w:r>
+        <w:t xml:space="preserve">Grupo Hospitalario Valdecruz</w:t>
+      </w:r>
+    </w:p>
+    <w:p>
+      <w:pPr>
+        <w:pStyle w:val="Heading2"/>
+      </w:pPr>
+      <w:r>
+        <w:t xml:space="preserve">Presupuesto</w:t>
+      </w:r>
+    </w:p>
+    <w:p>
+      <w:pPr>
+        <w:pStyle w:val="ListBullet"/>
+      </w:pPr>
+      <w:r>
+        <w:t xml:space="preserve">18.000–27.000 € al año</w:t>
+      </w:r>
+    </w:p>
+    <w:p>
+      <w:pPr>
+        <w:pStyle w:val="Heading2"/>
+      </w:pPr>
+      <w:r>
+        <w:t>Dónde se trata cada punto</w:t>
+      </w:r>
+    </w:p>
+    <w:tbl>
+      <w:tblPr>
+        <w:tblStyle w:val="LightGrid-Accent1"/>
+        <w:tblW w:type="auto" w:w="0"/>
+        <w:tblLook w:firstColumn="1" w:firstRow="1" w:lastColumn="0" w:lastRow="0" w:noHBand="0" w:noVBand="1" w:val="04A0"/>
+      </w:tblPr>
+      <w:tblGrid>
+        <w:gridCol w:w="2160"/>
+        <w:gridCol w:w="2160"/>
+        <w:gridCol w:w="2160"/>
+        <w:gridCol w:w="2160"/>
+      </w:tblGrid>
+      <w:tr>
+        <w:tc>
+          <w:tcPr>
+            <w:tcW w:type="dxa" w:w="2160"/>
+          </w:tcPr>
+          <w:p>
+            <w:r>
+              <w:t>Punto</w:t>
+            </w:r>
+          </w:p>
+        </w:tc>
+        <w:tc>
+          <w:tcPr>
+            <w:tcW w:type="dxa" w:w="2160"/>
+          </w:tcPr>
+          <w:p>
+            <w:r>
+              <w:t>Lo que pedisteis</w:t>
+            </w:r>
+          </w:p>
+        </w:tc>
+        <w:tc>
+          <w:tcPr>
+            <w:tcW w:type="dxa" w:w="2160"/>
+          </w:tcPr>
+          <w:p>
+            <w:r>
+              <w:t>Dónde se trata</w:t>
+            </w:r>
+          </w:p>
+        </w:tc>
+        <w:tc>
+          <w:tcPr>
+            <w:tcW w:type="dxa" w:w="2160"/>
+          </w:tcPr>
+          <w:p>
+            <w:r>
+              <w:t>Estado</w:t>
+            </w:r>
+          </w:p>
+        </w:tc>
+      </w:tr>
+      <w:tr>
+        <w:tc>
+          <w:tcPr>
+            <w:tcW w:type="dxa" w:w="2160"/>
+          </w:tcPr>
+          <w:p>
+            <w:r>
+              <w:t xml:space="preserve">Objetivo</w:t>
+            </w:r>
+          </w:p>
+        </w:tc>
+        <w:tc>
+          <w:tcPr>
+            <w:tcW w:type="dxa" w:w="2160"/>
+          </w:tcPr>
+          <w:p>
+            <w:r>
+              <w:t xml:space="preserve">Recomendación espontánea en asistentes de IA en Madrid y Barcelona</w:t>
+            </w:r>
+          </w:p>
+        </w:tc>
+        <w:tc>
+          <w:tcPr>
+            <w:tcW w:type="dxa" w:w="2160"/>
+          </w:tcPr>
+          <w:p>
+            <w:r>
+              <w:t xml:space="preserve">Acciones A1, A2</w:t>
+            </w:r>
+          </w:p>
+        </w:tc>
+        <w:tc>
+          <w:tcPr>
+            <w:tcW w:type="dxa" w:w="2160"/>
+          </w:tcPr>
+          <w:p>
+            <w:r>
+              <w:t xml:space="preserve">Cubierto</w:t>
+            </w:r>
+          </w:p>
+        </w:tc>
+      </w:tr>
+      <w:tr>
+        <w:tc>
+          <w:tcPr>
+            <w:tcW w:type="dxa" w:w="2160"/>
+          </w:tcPr>
+          <w:p>
+            <w:r>
+              <w:t xml:space="preserve">Objetivo</w:t>
+            </w:r>
+          </w:p>
+        </w:tc>
+        <w:tc>
+          <w:tcPr>
+            <w:tcW w:type="dxa" w:w="2160"/>
+          </w:tcPr>
+          <w:p>
+            <w:r>
+              <w:t xml:space="preserve">+25 % de primeras visitas de cirugía refractiva en 12 meses</w:t>
+            </w:r>
+          </w:p>
+        </w:tc>
+        <w:tc>
+          <w:tcPr>
+            <w:tcW w:type="dxa" w:w="2160"/>
+          </w:tcPr>
+          <w:p>
+            <w:r>
+              <w:t xml:space="preserve">Acciones A1, A2</w:t>
+            </w:r>
+          </w:p>
+        </w:tc>
+        <w:tc>
+          <w:tcPr>
+            <w:tcW w:type="dxa" w:w="2160"/>
+          </w:tcPr>
+          <w:p>
+            <w:r>
+              <w:t xml:space="preserve">Cubierto</w:t>
+            </w:r>
+          </w:p>
+        </w:tc>
+      </w:tr>
+      <w:tr>
+        <w:tc>
+          <w:tcPr>
+            <w:tcW w:type="dxa" w:w="2160"/>
+          </w:tcPr>
+          <w:p>
+            <w:r>
+              <w:t xml:space="preserve">Restricción</w:t>
+            </w:r>
+          </w:p>
+        </w:tc>
+        <w:tc>
+          <w:tcPr>
+            <w:tcW w:type="dxa" w:w="2160"/>
+          </w:tcPr>
+          <w:p>
+            <w:r>
+              <w:t xml:space="preserve">Publicidad sanitaria regulada: no prometer resultados</w:t>
+            </w:r>
+          </w:p>
+        </w:tc>
+        <w:tc>
+          <w:tcPr>
+            <w:tcW w:type="dxa" w:w="2160"/>
+          </w:tcPr>
+          <w:p>
+            <w:r>
+              <w:t xml:space="preserve">La declaran todas las acciones del plan.</w:t>
+            </w:r>
+          </w:p>
+        </w:tc>
+        <w:tc>
+          <w:tcPr>
+            <w:tcW w:type="dxa" w:w="2160"/>
+          </w:tcPr>
+          <w:p>
+            <w:r>
+              <w:t xml:space="preserve">Cubierto</w:t>
+            </w:r>
+          </w:p>
+        </w:tc>
+      </w:tr>
+      <w:tr>
+        <w:tc>
+          <w:tcPr>
+            <w:tcW w:type="dxa" w:w="2160"/>
+          </w:tcPr>
+          <w:p>
+            <w:r>
+              <w:t xml:space="preserve">Restricción</w:t>
+            </w:r>
+          </w:p>
+        </w:tc>
+        <w:tc>
+          <w:tcPr>
+            <w:tcW w:type="dxa" w:w="2160"/>
+          </w:tcPr>
+          <w:p>
+            <w:r>
+              <w:t xml:space="preserve">Sin comparativas denigratorias</w:t>
+            </w:r>
+          </w:p>
+        </w:tc>
+        <w:tc>
+          <w:tcPr>
+            <w:tcW w:type="dxa" w:w="2160"/>
+          </w:tcPr>
+          <w:p>
+            <w:r>
+              <w:t xml:space="preserve">La declaran todas las acciones del plan.</w:t>
+            </w:r>
+          </w:p>
+        </w:tc>
+        <w:tc>
+          <w:tcPr>
+            <w:tcW w:type="dxa" w:w="2160"/>
+          </w:tcPr>
+          <w:p>
+            <w:r>
+              <w:t xml:space="preserve">Cubierto</w:t>
+            </w:r>
+          </w:p>
+        </w:tc>
+      </w:tr>
+      <w:tr>
+        <w:tc>
+          <w:tcPr>
+            <w:tcW w:type="dxa" w:w="2160"/>
+          </w:tcPr>
+          <w:p>
+            <w:r>
+              <w:t xml:space="preserve">Servicio prioritario</w:t>
+            </w:r>
+          </w:p>
+        </w:tc>
+        <w:tc>
+          <w:tcPr>
+            <w:tcW w:type="dxa" w:w="2160"/>
+          </w:tcPr>
+          <w:p>
+            <w:r>
+              <w:t xml:space="preserve">Cirugía refractiva</w:t>
+            </w:r>
+          </w:p>
+        </w:tc>
+        <w:tc>
+          <w:tcPr>
+            <w:tcW w:type="dxa" w:w="2160"/>
+          </w:tcPr>
+          <w:p>
+            <w:r>
+              <w:t xml:space="preserve">Acciones A1, A2</w:t>
+            </w:r>
+          </w:p>
+        </w:tc>
+        <w:tc>
+          <w:tcPr>
+            <w:tcW w:type="dxa" w:w="2160"/>
+          </w:tcPr>
+          <w:p>
+            <w:r>
+              <w:t xml:space="preserve">Cubierto</w:t>
+            </w:r>
+          </w:p>
+        </w:tc>
+      </w:tr>
+      <w:tr>
+        <w:tc>
+          <w:tcPr>
+            <w:tcW w:type="dxa" w:w="2160"/>
+          </w:tcPr>
+          <w:p>
+            <w:r>
+              <w:t xml:space="preserve">Servicio prioritario</w:t>
+            </w:r>
+          </w:p>
+        </w:tc>
+        <w:tc>
+          <w:tcPr>
+            <w:tcW w:type="dxa" w:w="2160"/>
+          </w:tcPr>
+          <w:p>
+            <w:r>
+              <w:t xml:space="preserve">Control de miopía infantil</w:t>
+            </w:r>
+          </w:p>
+        </w:tc>
+        <w:tc>
+          <w:tcPr>
+            <w:tcW w:type="dxa" w:w="2160"/>
+          </w:tcPr>
+          <w:p>
+            <w:r>
+              <w:t xml:space="preserve">Acciones A1, A2</w:t>
+            </w:r>
+          </w:p>
+        </w:tc>
+        <w:tc>
+          <w:tcPr>
+            <w:tcW w:type="dxa" w:w="2160"/>
+          </w:tcPr>
+          <w:p>
+            <w:r>
+              <w:t xml:space="preserve">Cubierto</w:t>
+            </w:r>
+          </w:p>
+        </w:tc>
+      </w:tr>
+      <w:tr>
+        <w:tc>
+          <w:tcPr>
+            <w:tcW w:type="dxa" w:w="2160"/>
+          </w:tcPr>
+          <w:p>
+            <w:r>
+              <w:t xml:space="preserve">Ciudad</w:t>
+            </w:r>
+          </w:p>
+        </w:tc>
+        <w:tc>
+          <w:tcPr>
+            <w:tcW w:type="dxa" w:w="2160"/>
+          </w:tcPr>
+          <w:p>
+            <w:r>
+              <w:t xml:space="preserve">Madrid</w:t>
+            </w:r>
+          </w:p>
+        </w:tc>
+        <w:tc>
+          <w:tcPr>
+            <w:tcW w:type="dxa" w:w="2160"/>
+          </w:tcPr>
+          <w:p>
+            <w:r>
+              <w:t xml:space="preserve">Acciones A1, A2</w:t>
+            </w:r>
+          </w:p>
+        </w:tc>
+        <w:tc>
+          <w:tcPr>
+            <w:tcW w:type="dxa" w:w="2160"/>
+          </w:tcPr>
+          <w:p>
+            <w:r>
+              <w:t xml:space="preserve">Cubierto</w:t>
+            </w:r>
+          </w:p>
+        </w:tc>
+      </w:tr>
+      <w:tr>
+        <w:tc>
+          <w:tcPr>
+            <w:tcW w:type="dxa" w:w="2160"/>
+          </w:tcPr>
+          <w:p>
+            <w:r>
+              <w:t xml:space="preserve">Ciudad</w:t>
+            </w:r>
+          </w:p>
+        </w:tc>
+        <w:tc>
+          <w:tcPr>
+            <w:tcW w:type="dxa" w:w="2160"/>
+          </w:tcPr>
+          <w:p>
+            <w:r>
+              <w:t xml:space="preserve">Barcelona</w:t>
+            </w:r>
+          </w:p>
+        </w:tc>
+        <w:tc>
+          <w:tcPr>
+            <w:tcW w:type="dxa" w:w="2160"/>
+          </w:tcPr>
+          <w:p>
+            <w:r>
+              <w:t xml:space="preserve">Acciones A1, A2</w:t>
+            </w:r>
+          </w:p>
+        </w:tc>
+        <w:tc>
+          <w:tcPr>
+            <w:tcW w:type="dxa" w:w="2160"/>
+          </w:tcPr>
+          <w:p>
+            <w:r>
+              <w:t xml:space="preserve">Cubierto</w:t>
+            </w:r>
+          </w:p>
+        </w:tc>
+      </w:tr>
+      <w:tr>
+        <w:tc>
+          <w:tcPr>
+            <w:tcW w:type="dxa" w:w="2160"/>
+          </w:tcPr>
+          <w:p>
+            <w:r>
+              <w:t xml:space="preserve">Público</w:t>
+            </w:r>
+          </w:p>
+        </w:tc>
+        <w:tc>
+          <w:tcPr>
+            <w:tcW w:type="dxa" w:w="2160"/>
+          </w:tcPr>
+          <w:p>
+            <w:r>
+              <w:t xml:space="preserve">Adultos de 25 a 50 años con miopía o astigmatismo</w:t>
+            </w:r>
+          </w:p>
+        </w:tc>
+        <w:tc>
+          <w:tcPr>
+            <w:tcW w:type="dxa" w:w="2160"/>
+          </w:tcPr>
+          <w:p>
+            <w:r>
+              <w:t xml:space="preserve">Acciones A1, A2</w:t>
+            </w:r>
+          </w:p>
+        </w:tc>
+        <w:tc>
+          <w:tcPr>
+            <w:tcW w:type="dxa" w:w="2160"/>
+          </w:tcPr>
+          <w:p>
+            <w:r>
+              <w:t xml:space="preserve">Cubierto</w:t>
+            </w:r>
+          </w:p>
+        </w:tc>
+      </w:tr>
+      <w:tr>
+        <w:tc>
+          <w:tcPr>
+            <w:tcW w:type="dxa" w:w="2160"/>
+          </w:tcPr>
+          <w:p>
+            <w:r>
+              <w:t xml:space="preserve">Público</w:t>
+            </w:r>
+          </w:p>
+        </w:tc>
+        <w:tc>
+          <w:tcPr>
+            <w:tcW w:type="dxa" w:w="2160"/>
+          </w:tcPr>
+          <w:p>
+            <w:r>
+              <w:t xml:space="preserve">Mayores de 60 años con cataratas y sus hijos</w:t>
+            </w:r>
+          </w:p>
+        </w:tc>
+        <w:tc>
+          <w:tcPr>
+            <w:tcW w:type="dxa" w:w="2160"/>
+          </w:tcPr>
+          <w:p>
+            <w:r>
+              <w:t xml:space="preserve">Acciones A1, A2</w:t>
+            </w:r>
+          </w:p>
+        </w:tc>
+        <w:tc>
+          <w:tcPr>
+            <w:tcW w:type="dxa" w:w="2160"/>
+          </w:tcPr>
+          <w:p>
+            <w:r>
+              <w:t xml:space="preserve">Cubierto</w:t>
+            </w:r>
+          </w:p>
+        </w:tc>
+      </w:tr>
+      <w:tr>
+        <w:tc>
+          <w:tcPr>
+            <w:tcW w:type="dxa" w:w="2160"/>
+          </w:tcPr>
+          <w:p>
+            <w:r>
+              <w:t xml:space="preserve">Público</w:t>
+            </w:r>
+          </w:p>
+        </w:tc>
+        <w:tc>
+          <w:tcPr>
+            <w:tcW w:type="dxa" w:w="2160"/>
+          </w:tcPr>
+          <w:p>
+            <w:r>
+              <w:t xml:space="preserve">Padres de niños con miopía progresiva</w:t>
+            </w:r>
+          </w:p>
+        </w:tc>
+        <w:tc>
+          <w:tcPr>
+            <w:tcW w:type="dxa" w:w="2160"/>
+          </w:tcPr>
+          <w:p>
+            <w:r>
+              <w:t xml:space="preserve">Acciones A1, A2</w:t>
+            </w:r>
+          </w:p>
+        </w:tc>
+        <w:tc>
+          <w:tcPr>
+            <w:tcW w:type="dxa" w:w="2160"/>
+          </w:tcPr>
+          <w:p>
+            <w:r>
+              <w:t xml:space="preserve">Cubierto</w:t>
+            </w:r>
+          </w:p>
+        </w:tc>
+      </w:tr>
+      <w:tr>
+        <w:tc>
+          <w:tcPr>
+            <w:tcW w:type="dxa" w:w="2160"/>
+          </w:tcPr>
+          <w:p>
+            <w:r>
+              <w:t xml:space="preserve">Público</w:t>
+            </w:r>
+          </w:p>
+        </w:tc>
+        <w:tc>
+          <w:tcPr>
+            <w:tcW w:type="dxa" w:w="2160"/>
+          </w:tcPr>
+          <w:p>
+            <w:r>
+              <w:t xml:space="preserve">Profesionales con requisitos específicos (pilotos)</w:t>
+            </w:r>
+          </w:p>
+        </w:tc>
+        <w:tc>
+          <w:tcPr>
+            <w:tcW w:type="dxa" w:w="2160"/>
+          </w:tcPr>
+          <w:p>
+            <w:r>
+              <w:t xml:space="preserve">pendiente: Ninguna acción ni hallazgo de la propuesta lo trata.</w:t>
+            </w:r>
+          </w:p>
+        </w:tc>
+        <w:tc>
+          <w:tcPr>
+            <w:tcW w:type="dxa" w:w="2160"/>
+          </w:tcPr>
+          <w:p>
+            <w:r>
+              <w:t xml:space="preserve">Pendiente</w:t>
+            </w:r>
+          </w:p>
+        </w:tc>
+      </w:tr>
+      <w:tr>
+        <w:tc>
+          <w:tcPr>
+            <w:tcW w:type="dxa" w:w="2160"/>
+          </w:tcPr>
+          <w:p>
+            <w:r>
+              <w:t xml:space="preserve">Competidor declarado</w:t>
+            </w:r>
+          </w:p>
+        </w:tc>
+        <w:tc>
+          <w:tcPr>
+            <w:tcW w:type="dxa" w:w="2160"/>
+          </w:tcPr>
+          <w:p>
+            <w:r>
+              <w:t xml:space="preserve">Instituto Oftálmico Tramuntana</w:t>
+            </w:r>
+          </w:p>
+        </w:tc>
+        <w:tc>
+          <w:tcPr>
+            <w:tcW w:type="dxa" w:w="2160"/>
+          </w:tcPr>
+          <w:p>
+            <w:r>
+              <w:t xml:space="preserve">Acciones A1, A2</w:t>
+            </w:r>
+          </w:p>
+        </w:tc>
+        <w:tc>
+          <w:tcPr>
+            <w:tcW w:type="dxa" w:w="2160"/>
+          </w:tcPr>
+          <w:p>
+            <w:r>
+              <w:t xml:space="preserve">Cubierto</w:t>
+            </w:r>
+          </w:p>
+        </w:tc>
+      </w:tr>
+      <w:tr>
+        <w:tc>
+          <w:tcPr>
+            <w:tcW w:type="dxa" w:w="2160"/>
+          </w:tcPr>
+          <w:p>
+            <w:r>
+              <w:t xml:space="preserve">Competidor declarado</w:t>
+            </w:r>
+          </w:p>
+        </w:tc>
+        <w:tc>
+          <w:tcPr>
+            <w:tcW w:type="dxa" w:w="2160"/>
+          </w:tcPr>
+          <w:p>
+            <w:r>
+              <w:t xml:space="preserve">Láser Nítida</w:t>
+            </w:r>
+          </w:p>
+        </w:tc>
+        <w:tc>
+          <w:tcPr>
+            <w:tcW w:type="dxa" w:w="2160"/>
+          </w:tcPr>
+          <w:p>
+            <w:r>
+              <w:t xml:space="preserve">Acciones A1, A2</w:t>
+            </w:r>
+          </w:p>
+        </w:tc>
+        <w:tc>
+          <w:tcPr>
+            <w:tcW w:type="dxa" w:w="2160"/>
+          </w:tcPr>
+          <w:p>
+            <w:r>
+              <w:t xml:space="preserve">Cubierto</w:t>
+            </w:r>
+          </w:p>
+        </w:tc>
+      </w:tr>
+      <w:tr>
+        <w:tc>
+          <w:tcPr>
+            <w:tcW w:type="dxa" w:w="2160"/>
+          </w:tcPr>
+          <w:p>
+            <w:r>
+              <w:t xml:space="preserve">Competidor declarado</w:t>
+            </w:r>
+          </w:p>
+        </w:tc>
+        <w:tc>
+          <w:tcPr>
+            <w:tcW w:type="dxa" w:w="2160"/>
+          </w:tcPr>
+          <w:p>
+            <w:r>
+              <w:t xml:space="preserve">Grupo Hospitalario Valdecruz</w:t>
+            </w:r>
+          </w:p>
+        </w:tc>
+        <w:tc>
+          <w:tcPr>
+            <w:tcW w:type="dxa" w:w="2160"/>
+          </w:tcPr>
+          <w:p>
+            <w:r>
+              <w:t xml:space="preserve">Acciones A1, A2</w:t>
+            </w:r>
+          </w:p>
+        </w:tc>
+        <w:tc>
+          <w:tcPr>
+            <w:tcW w:type="dxa" w:w="2160"/>
+          </w:tcPr>
+          <w:p>
+            <w:r>
+              <w:t xml:space="preserve">Cubierto</w:t>
+            </w:r>
+          </w:p>
+        </w:tc>
+      </w:tr>
+      <w:tr>
+        <w:tc>
+          <w:tcPr>
+            <w:tcW w:type="dxa" w:w="2160"/>
+          </w:tcPr>
+          <w:p>
+            <w:r>
+              <w:t xml:space="preserve">Presupuesto</w:t>
+            </w:r>
+          </w:p>
+        </w:tc>
+        <w:tc>
+          <w:tcPr>
+            <w:tcW w:type="dxa" w:w="2160"/>
+          </w:tcPr>
+          <w:p>
+            <w:r>
+              <w:t xml:space="preserve">18.000–27.000 € al año</w:t>
+            </w:r>
+          </w:p>
+        </w:tc>
+        <w:tc>
+          <w:tcPr>
+            <w:tcW w:type="dxa" w:w="2160"/>
+          </w:tcPr>
+          <w:p>
+            <w:r>
+              <w:t xml:space="preserve">Plan de 22.000 €, dentro del máximo de 27.000 €.</w:t>
+            </w:r>
+          </w:p>
+        </w:tc>
+        <w:tc>
+          <w:tcPr>
+            <w:tcW w:type="dxa" w:w="2160"/>
+          </w:tcPr>
+          <w:p>
+            <w:r>
+              <w:t xml:space="preserve">Cubierto</w:t>
+            </w:r>
+          </w:p>
+        </w:tc>
+      </w:tr>
+    </w:tbl>
+    <w:p/>
+    <w:p>
+      <w:pPr>
+        <w:pStyle w:val="Heading1"/>
+      </w:pPr>
+      <w:r>
+        <w:t>3. Contexto y alcance</w:t>
       </w:r>
     </w:p>
     <w:tbl>
@@ -257,7 +1190,7 @@
         <w:pStyle w:val="Heading1"/>
       </w:pPr>
       <w:r>
-        <w:t>3. Diagnóstico de visibilidad</w:t>
+        <w:t>4. Diagnóstico de visibilidad</w:t>
       </w:r>
     </w:p>
     <w:p>
@@ -2309,7 +3242,7 @@
         <w:pStyle w:val="Heading1"/>
       </w:pPr>
       <w:r>
-        <w:t>4. Análisis de la competencia</w:t>
+        <w:t>5. Análisis de la competencia</w:t>
       </w:r>
     </w:p>
     <w:p>
@@ -4380,7 +5313,7 @@
         <w:pStyle w:val="Heading1"/>
       </w:pPr>
       <w:r>
-        <w:t>5. Hallazgos clave</w:t>
+        <w:t>6. Hallazgos clave</w:t>
       </w:r>
     </w:p>
     <w:p>
@@ -5487,7 +6420,7 @@
         <w:pStyle w:val="Heading1"/>
       </w:pPr>
       <w:r>
-        <w:t>6. Estrategia recomendada</w:t>
+        <w:t>7. Estrategia recomendada</w:t>
       </w:r>
     </w:p>
     <w:p>
@@ -5630,7 +6563,7 @@
         <w:pStyle w:val="Heading1"/>
       </w:pPr>
       <w:r>
-        <w:t>7. Plan de acción por fases</w:t>
+        <w:t>8. Plan de acción por fases</w:t>
       </w:r>
     </w:p>
     <w:tbl>
@@ -6244,7 +7177,7 @@
         <w:pStyle w:val="Heading1"/>
       </w:pPr>
       <w:r>
-        <w:t>8. Medición y seguimiento</w:t>
+        <w:t>9. Medición y seguimiento</w:t>
       </w:r>
     </w:p>
     <w:p>
@@ -6332,7 +7265,7 @@
         <w:pStyle w:val="Heading1"/>
       </w:pPr>
       <w:r>
-        <w:t>9. Riesgos y supuestos</w:t>
+        <w:t>10. Riesgos y supuestos</w:t>
       </w:r>
     </w:p>
     <w:tbl>
@@ -6396,7 +7329,7 @@
         <w:pStyle w:val="Heading1"/>
       </w:pPr>
       <w:r>
-        <w:t>10. Hoja de ruta y presupuesto</w:t>
+        <w:t>11. Hoja de ruta y presupuesto</w:t>
       </w:r>
     </w:p>
     <w:p>

</xml_diff>

<commit_message>
feat(write): encargo del brief y su cobertura en la propuesta y el Word (#34)
El nodo write usa write.v2: el redactor enlaza cada punto del brief con
acciones o hallazgos y domain.brief_coverage decide la cobertura. Reintenta
una vez si falta algo y lo declara en contexto.limitaciones si persiste.
El Word abre con «2. Lo que nos habéis pedido» y el fixture cubre los 16
puntos de Alborada.

Co-authored-by: Claude Opus 5.5 <noreply@anthropic.com>
</commit_message>
<xml_diff>
--- a/docs/ejemplos/propuesta_alborada_ejemplo.docx
+++ b/docs/ejemplos/propuesta_alborada_ejemplo.docx
@@ -51,7 +51,940 @@
         <w:pStyle w:val="Heading1"/>
       </w:pPr>
       <w:r>
-        <w:t>2. Contexto y alcance</w:t>
+        <w:t>2. Lo que nos habéis pedido</w:t>
+      </w:r>
+    </w:p>
+    <w:p>
+      <w:r>
+        <w:t xml:space="preserve">Esto es lo que nos pedisteis en el brief, tal cual, y dónde lo trata esta propuesta. La cobertura la comprueba el sistema contra el plan y los hallazgos, no la redacción.</w:t>
+      </w:r>
+    </w:p>
+    <w:p>
+      <w:pPr>
+        <w:pStyle w:val="Heading2"/>
+      </w:pPr>
+      <w:r>
+        <w:t xml:space="preserve">Objetivos</w:t>
+      </w:r>
+    </w:p>
+    <w:p>
+      <w:pPr>
+        <w:pStyle w:val="ListBullet"/>
+      </w:pPr>
+      <w:r>
+        <w:t xml:space="preserve">Recomendación espontánea en asistentes de IA en Madrid y Barcelona</w:t>
+      </w:r>
+    </w:p>
+    <w:p>
+      <w:pPr>
+        <w:pStyle w:val="ListBullet"/>
+      </w:pPr>
+      <w:r>
+        <w:t xml:space="preserve">+25 % de primeras visitas de cirugía refractiva en 12 meses</w:t>
+      </w:r>
+    </w:p>
+    <w:p>
+      <w:pPr>
+        <w:pStyle w:val="Heading2"/>
+      </w:pPr>
+      <w:r>
+        <w:t xml:space="preserve">Restricciones</w:t>
+      </w:r>
+    </w:p>
+    <w:p>
+      <w:pPr>
+        <w:pStyle w:val="ListBullet"/>
+      </w:pPr>
+      <w:r>
+        <w:t xml:space="preserve">Publicidad sanitaria regulada: no prometer resultados</w:t>
+      </w:r>
+    </w:p>
+    <w:p>
+      <w:pPr>
+        <w:pStyle w:val="ListBullet"/>
+      </w:pPr>
+      <w:r>
+        <w:t xml:space="preserve">Sin comparativas denigratorias</w:t>
+      </w:r>
+    </w:p>
+    <w:p>
+      <w:pPr>
+        <w:pStyle w:val="Heading2"/>
+      </w:pPr>
+      <w:r>
+        <w:t xml:space="preserve">Servicios prioritarios</w:t>
+      </w:r>
+    </w:p>
+    <w:p>
+      <w:pPr>
+        <w:pStyle w:val="ListBullet"/>
+      </w:pPr>
+      <w:r>
+        <w:t xml:space="preserve">Cirugía refractiva</w:t>
+      </w:r>
+    </w:p>
+    <w:p>
+      <w:pPr>
+        <w:pStyle w:val="ListBullet"/>
+      </w:pPr>
+      <w:r>
+        <w:t xml:space="preserve">Control de miopía infantil</w:t>
+      </w:r>
+    </w:p>
+    <w:p>
+      <w:pPr>
+        <w:pStyle w:val="Heading2"/>
+      </w:pPr>
+      <w:r>
+        <w:t xml:space="preserve">Ciudades</w:t>
+      </w:r>
+    </w:p>
+    <w:p>
+      <w:pPr>
+        <w:pStyle w:val="ListBullet"/>
+      </w:pPr>
+      <w:r>
+        <w:t xml:space="preserve">Madrid</w:t>
+      </w:r>
+    </w:p>
+    <w:p>
+      <w:pPr>
+        <w:pStyle w:val="ListBullet"/>
+      </w:pPr>
+      <w:r>
+        <w:t xml:space="preserve">Barcelona</w:t>
+      </w:r>
+    </w:p>
+    <w:p>
+      <w:pPr>
+        <w:pStyle w:val="Heading2"/>
+      </w:pPr>
+      <w:r>
+        <w:t xml:space="preserve">Públicos</w:t>
+      </w:r>
+    </w:p>
+    <w:p>
+      <w:pPr>
+        <w:pStyle w:val="ListBullet"/>
+      </w:pPr>
+      <w:r>
+        <w:t xml:space="preserve">Adultos de 25 a 50 años con miopía o astigmatismo</w:t>
+      </w:r>
+    </w:p>
+    <w:p>
+      <w:pPr>
+        <w:pStyle w:val="ListBullet"/>
+      </w:pPr>
+      <w:r>
+        <w:t xml:space="preserve">Mayores de 60 años con cataratas y sus hijos</w:t>
+      </w:r>
+    </w:p>
+    <w:p>
+      <w:pPr>
+        <w:pStyle w:val="ListBullet"/>
+      </w:pPr>
+      <w:r>
+        <w:t xml:space="preserve">Padres de niños con miopía progresiva</w:t>
+      </w:r>
+    </w:p>
+    <w:p>
+      <w:pPr>
+        <w:pStyle w:val="ListBullet"/>
+      </w:pPr>
+      <w:r>
+        <w:t xml:space="preserve">Profesionales con requisitos específicos (pilotos)</w:t>
+      </w:r>
+    </w:p>
+    <w:p>
+      <w:pPr>
+        <w:pStyle w:val="Heading2"/>
+      </w:pPr>
+      <w:r>
+        <w:t xml:space="preserve">Competidores declarados</w:t>
+      </w:r>
+    </w:p>
+    <w:p>
+      <w:pPr>
+        <w:pStyle w:val="ListBullet"/>
+      </w:pPr>
+      <w:r>
+        <w:t xml:space="preserve">Instituto Oftálmico Tramuntana</w:t>
+      </w:r>
+    </w:p>
+    <w:p>
+      <w:pPr>
+        <w:pStyle w:val="ListBullet"/>
+      </w:pPr>
+      <w:r>
+        <w:t xml:space="preserve">Láser Nítida</w:t>
+      </w:r>
+    </w:p>
+    <w:p>
+      <w:pPr>
+        <w:pStyle w:val="ListBullet"/>
+      </w:pPr>
+      <w:r>
+        <w:t xml:space="preserve">Grupo Hospitalario Valdecruz</w:t>
+      </w:r>
+    </w:p>
+    <w:p>
+      <w:pPr>
+        <w:pStyle w:val="Heading2"/>
+      </w:pPr>
+      <w:r>
+        <w:t xml:space="preserve">Presupuesto</w:t>
+      </w:r>
+    </w:p>
+    <w:p>
+      <w:pPr>
+        <w:pStyle w:val="ListBullet"/>
+      </w:pPr>
+      <w:r>
+        <w:t xml:space="preserve">18.000–27.000 € al año</w:t>
+      </w:r>
+    </w:p>
+    <w:p>
+      <w:pPr>
+        <w:pStyle w:val="Heading2"/>
+      </w:pPr>
+      <w:r>
+        <w:t>Dónde se trata cada punto</w:t>
+      </w:r>
+    </w:p>
+    <w:tbl>
+      <w:tblPr>
+        <w:tblStyle w:val="LightGrid-Accent1"/>
+        <w:tblW w:type="auto" w:w="0"/>
+        <w:tblLook w:firstColumn="1" w:firstRow="1" w:lastColumn="0" w:lastRow="0" w:noHBand="0" w:noVBand="1" w:val="04A0"/>
+      </w:tblPr>
+      <w:tblGrid>
+        <w:gridCol w:w="2160"/>
+        <w:gridCol w:w="2160"/>
+        <w:gridCol w:w="2160"/>
+        <w:gridCol w:w="2160"/>
+      </w:tblGrid>
+      <w:tr>
+        <w:tc>
+          <w:tcPr>
+            <w:tcW w:type="dxa" w:w="2160"/>
+          </w:tcPr>
+          <w:p>
+            <w:r>
+              <w:t>Punto</w:t>
+            </w:r>
+          </w:p>
+        </w:tc>
+        <w:tc>
+          <w:tcPr>
+            <w:tcW w:type="dxa" w:w="2160"/>
+          </w:tcPr>
+          <w:p>
+            <w:r>
+              <w:t>Lo que pedisteis</w:t>
+            </w:r>
+          </w:p>
+        </w:tc>
+        <w:tc>
+          <w:tcPr>
+            <w:tcW w:type="dxa" w:w="2160"/>
+          </w:tcPr>
+          <w:p>
+            <w:r>
+              <w:t>Dónde se trata</w:t>
+            </w:r>
+          </w:p>
+        </w:tc>
+        <w:tc>
+          <w:tcPr>
+            <w:tcW w:type="dxa" w:w="2160"/>
+          </w:tcPr>
+          <w:p>
+            <w:r>
+              <w:t>Estado</w:t>
+            </w:r>
+          </w:p>
+        </w:tc>
+      </w:tr>
+      <w:tr>
+        <w:tc>
+          <w:tcPr>
+            <w:tcW w:type="dxa" w:w="2160"/>
+          </w:tcPr>
+          <w:p>
+            <w:r>
+              <w:t xml:space="preserve">Objetivo</w:t>
+            </w:r>
+          </w:p>
+        </w:tc>
+        <w:tc>
+          <w:tcPr>
+            <w:tcW w:type="dxa" w:w="2160"/>
+          </w:tcPr>
+          <w:p>
+            <w:r>
+              <w:t xml:space="preserve">Recomendación espontánea en asistentes de IA en Madrid y Barcelona</w:t>
+            </w:r>
+          </w:p>
+        </w:tc>
+        <w:tc>
+          <w:tcPr>
+            <w:tcW w:type="dxa" w:w="2160"/>
+          </w:tcPr>
+          <w:p>
+            <w:r>
+              <w:t xml:space="preserve">Acciones A1, A2</w:t>
+            </w:r>
+          </w:p>
+        </w:tc>
+        <w:tc>
+          <w:tcPr>
+            <w:tcW w:type="dxa" w:w="2160"/>
+          </w:tcPr>
+          <w:p>
+            <w:r>
+              <w:t xml:space="preserve">Cubierto</w:t>
+            </w:r>
+          </w:p>
+        </w:tc>
+      </w:tr>
+      <w:tr>
+        <w:tc>
+          <w:tcPr>
+            <w:tcW w:type="dxa" w:w="2160"/>
+          </w:tcPr>
+          <w:p>
+            <w:r>
+              <w:t xml:space="preserve">Objetivo</w:t>
+            </w:r>
+          </w:p>
+        </w:tc>
+        <w:tc>
+          <w:tcPr>
+            <w:tcW w:type="dxa" w:w="2160"/>
+          </w:tcPr>
+          <w:p>
+            <w:r>
+              <w:t xml:space="preserve">+25 % de primeras visitas de cirugía refractiva en 12 meses</w:t>
+            </w:r>
+          </w:p>
+        </w:tc>
+        <w:tc>
+          <w:tcPr>
+            <w:tcW w:type="dxa" w:w="2160"/>
+          </w:tcPr>
+          <w:p>
+            <w:r>
+              <w:t xml:space="preserve">Acciones A1, A2</w:t>
+            </w:r>
+          </w:p>
+        </w:tc>
+        <w:tc>
+          <w:tcPr>
+            <w:tcW w:type="dxa" w:w="2160"/>
+          </w:tcPr>
+          <w:p>
+            <w:r>
+              <w:t xml:space="preserve">Cubierto</w:t>
+            </w:r>
+          </w:p>
+        </w:tc>
+      </w:tr>
+      <w:tr>
+        <w:tc>
+          <w:tcPr>
+            <w:tcW w:type="dxa" w:w="2160"/>
+          </w:tcPr>
+          <w:p>
+            <w:r>
+              <w:t xml:space="preserve">Restricción</w:t>
+            </w:r>
+          </w:p>
+        </w:tc>
+        <w:tc>
+          <w:tcPr>
+            <w:tcW w:type="dxa" w:w="2160"/>
+          </w:tcPr>
+          <w:p>
+            <w:r>
+              <w:t xml:space="preserve">Publicidad sanitaria regulada: no prometer resultados</w:t>
+            </w:r>
+          </w:p>
+        </w:tc>
+        <w:tc>
+          <w:tcPr>
+            <w:tcW w:type="dxa" w:w="2160"/>
+          </w:tcPr>
+          <w:p>
+            <w:r>
+              <w:t xml:space="preserve">La declaran todas las acciones del plan.</w:t>
+            </w:r>
+          </w:p>
+        </w:tc>
+        <w:tc>
+          <w:tcPr>
+            <w:tcW w:type="dxa" w:w="2160"/>
+          </w:tcPr>
+          <w:p>
+            <w:r>
+              <w:t xml:space="preserve">Cubierto</w:t>
+            </w:r>
+          </w:p>
+        </w:tc>
+      </w:tr>
+      <w:tr>
+        <w:tc>
+          <w:tcPr>
+            <w:tcW w:type="dxa" w:w="2160"/>
+          </w:tcPr>
+          <w:p>
+            <w:r>
+              <w:t xml:space="preserve">Restricción</w:t>
+            </w:r>
+          </w:p>
+        </w:tc>
+        <w:tc>
+          <w:tcPr>
+            <w:tcW w:type="dxa" w:w="2160"/>
+          </w:tcPr>
+          <w:p>
+            <w:r>
+              <w:t xml:space="preserve">Sin comparativas denigratorias</w:t>
+            </w:r>
+          </w:p>
+        </w:tc>
+        <w:tc>
+          <w:tcPr>
+            <w:tcW w:type="dxa" w:w="2160"/>
+          </w:tcPr>
+          <w:p>
+            <w:r>
+              <w:t xml:space="preserve">La declaran todas las acciones del plan.</w:t>
+            </w:r>
+          </w:p>
+        </w:tc>
+        <w:tc>
+          <w:tcPr>
+            <w:tcW w:type="dxa" w:w="2160"/>
+          </w:tcPr>
+          <w:p>
+            <w:r>
+              <w:t xml:space="preserve">Cubierto</w:t>
+            </w:r>
+          </w:p>
+        </w:tc>
+      </w:tr>
+      <w:tr>
+        <w:tc>
+          <w:tcPr>
+            <w:tcW w:type="dxa" w:w="2160"/>
+          </w:tcPr>
+          <w:p>
+            <w:r>
+              <w:t xml:space="preserve">Servicio prioritario</w:t>
+            </w:r>
+          </w:p>
+        </w:tc>
+        <w:tc>
+          <w:tcPr>
+            <w:tcW w:type="dxa" w:w="2160"/>
+          </w:tcPr>
+          <w:p>
+            <w:r>
+              <w:t xml:space="preserve">Cirugía refractiva</w:t>
+            </w:r>
+          </w:p>
+        </w:tc>
+        <w:tc>
+          <w:tcPr>
+            <w:tcW w:type="dxa" w:w="2160"/>
+          </w:tcPr>
+          <w:p>
+            <w:r>
+              <w:t xml:space="preserve">Acciones A1, A2</w:t>
+            </w:r>
+          </w:p>
+        </w:tc>
+        <w:tc>
+          <w:tcPr>
+            <w:tcW w:type="dxa" w:w="2160"/>
+          </w:tcPr>
+          <w:p>
+            <w:r>
+              <w:t xml:space="preserve">Cubierto</w:t>
+            </w:r>
+          </w:p>
+        </w:tc>
+      </w:tr>
+      <w:tr>
+        <w:tc>
+          <w:tcPr>
+            <w:tcW w:type="dxa" w:w="2160"/>
+          </w:tcPr>
+          <w:p>
+            <w:r>
+              <w:t xml:space="preserve">Servicio prioritario</w:t>
+            </w:r>
+          </w:p>
+        </w:tc>
+        <w:tc>
+          <w:tcPr>
+            <w:tcW w:type="dxa" w:w="2160"/>
+          </w:tcPr>
+          <w:p>
+            <w:r>
+              <w:t xml:space="preserve">Control de miopía infantil</w:t>
+            </w:r>
+          </w:p>
+        </w:tc>
+        <w:tc>
+          <w:tcPr>
+            <w:tcW w:type="dxa" w:w="2160"/>
+          </w:tcPr>
+          <w:p>
+            <w:r>
+              <w:t xml:space="preserve">Acciones A1, A2</w:t>
+            </w:r>
+          </w:p>
+        </w:tc>
+        <w:tc>
+          <w:tcPr>
+            <w:tcW w:type="dxa" w:w="2160"/>
+          </w:tcPr>
+          <w:p>
+            <w:r>
+              <w:t xml:space="preserve">Cubierto</w:t>
+            </w:r>
+          </w:p>
+        </w:tc>
+      </w:tr>
+      <w:tr>
+        <w:tc>
+          <w:tcPr>
+            <w:tcW w:type="dxa" w:w="2160"/>
+          </w:tcPr>
+          <w:p>
+            <w:r>
+              <w:t xml:space="preserve">Ciudad</w:t>
+            </w:r>
+          </w:p>
+        </w:tc>
+        <w:tc>
+          <w:tcPr>
+            <w:tcW w:type="dxa" w:w="2160"/>
+          </w:tcPr>
+          <w:p>
+            <w:r>
+              <w:t xml:space="preserve">Madrid</w:t>
+            </w:r>
+          </w:p>
+        </w:tc>
+        <w:tc>
+          <w:tcPr>
+            <w:tcW w:type="dxa" w:w="2160"/>
+          </w:tcPr>
+          <w:p>
+            <w:r>
+              <w:t xml:space="preserve">Acciones A1, A2</w:t>
+            </w:r>
+          </w:p>
+        </w:tc>
+        <w:tc>
+          <w:tcPr>
+            <w:tcW w:type="dxa" w:w="2160"/>
+          </w:tcPr>
+          <w:p>
+            <w:r>
+              <w:t xml:space="preserve">Cubierto</w:t>
+            </w:r>
+          </w:p>
+        </w:tc>
+      </w:tr>
+      <w:tr>
+        <w:tc>
+          <w:tcPr>
+            <w:tcW w:type="dxa" w:w="2160"/>
+          </w:tcPr>
+          <w:p>
+            <w:r>
+              <w:t xml:space="preserve">Ciudad</w:t>
+            </w:r>
+          </w:p>
+        </w:tc>
+        <w:tc>
+          <w:tcPr>
+            <w:tcW w:type="dxa" w:w="2160"/>
+          </w:tcPr>
+          <w:p>
+            <w:r>
+              <w:t xml:space="preserve">Barcelona</w:t>
+            </w:r>
+          </w:p>
+        </w:tc>
+        <w:tc>
+          <w:tcPr>
+            <w:tcW w:type="dxa" w:w="2160"/>
+          </w:tcPr>
+          <w:p>
+            <w:r>
+              <w:t xml:space="preserve">Acciones A1, A2</w:t>
+            </w:r>
+          </w:p>
+        </w:tc>
+        <w:tc>
+          <w:tcPr>
+            <w:tcW w:type="dxa" w:w="2160"/>
+          </w:tcPr>
+          <w:p>
+            <w:r>
+              <w:t xml:space="preserve">Cubierto</w:t>
+            </w:r>
+          </w:p>
+        </w:tc>
+      </w:tr>
+      <w:tr>
+        <w:tc>
+          <w:tcPr>
+            <w:tcW w:type="dxa" w:w="2160"/>
+          </w:tcPr>
+          <w:p>
+            <w:r>
+              <w:t xml:space="preserve">Público</w:t>
+            </w:r>
+          </w:p>
+        </w:tc>
+        <w:tc>
+          <w:tcPr>
+            <w:tcW w:type="dxa" w:w="2160"/>
+          </w:tcPr>
+          <w:p>
+            <w:r>
+              <w:t xml:space="preserve">Adultos de 25 a 50 años con miopía o astigmatismo</w:t>
+            </w:r>
+          </w:p>
+        </w:tc>
+        <w:tc>
+          <w:tcPr>
+            <w:tcW w:type="dxa" w:w="2160"/>
+          </w:tcPr>
+          <w:p>
+            <w:r>
+              <w:t xml:space="preserve">Acciones A1, A2</w:t>
+            </w:r>
+          </w:p>
+        </w:tc>
+        <w:tc>
+          <w:tcPr>
+            <w:tcW w:type="dxa" w:w="2160"/>
+          </w:tcPr>
+          <w:p>
+            <w:r>
+              <w:t xml:space="preserve">Cubierto</w:t>
+            </w:r>
+          </w:p>
+        </w:tc>
+      </w:tr>
+      <w:tr>
+        <w:tc>
+          <w:tcPr>
+            <w:tcW w:type="dxa" w:w="2160"/>
+          </w:tcPr>
+          <w:p>
+            <w:r>
+              <w:t xml:space="preserve">Público</w:t>
+            </w:r>
+          </w:p>
+        </w:tc>
+        <w:tc>
+          <w:tcPr>
+            <w:tcW w:type="dxa" w:w="2160"/>
+          </w:tcPr>
+          <w:p>
+            <w:r>
+              <w:t xml:space="preserve">Mayores de 60 años con cataratas y sus hijos</w:t>
+            </w:r>
+          </w:p>
+        </w:tc>
+        <w:tc>
+          <w:tcPr>
+            <w:tcW w:type="dxa" w:w="2160"/>
+          </w:tcPr>
+          <w:p>
+            <w:r>
+              <w:t xml:space="preserve">Acciones A1, A2</w:t>
+            </w:r>
+          </w:p>
+        </w:tc>
+        <w:tc>
+          <w:tcPr>
+            <w:tcW w:type="dxa" w:w="2160"/>
+          </w:tcPr>
+          <w:p>
+            <w:r>
+              <w:t xml:space="preserve">Cubierto</w:t>
+            </w:r>
+          </w:p>
+        </w:tc>
+      </w:tr>
+      <w:tr>
+        <w:tc>
+          <w:tcPr>
+            <w:tcW w:type="dxa" w:w="2160"/>
+          </w:tcPr>
+          <w:p>
+            <w:r>
+              <w:t xml:space="preserve">Público</w:t>
+            </w:r>
+          </w:p>
+        </w:tc>
+        <w:tc>
+          <w:tcPr>
+            <w:tcW w:type="dxa" w:w="2160"/>
+          </w:tcPr>
+          <w:p>
+            <w:r>
+              <w:t xml:space="preserve">Padres de niños con miopía progresiva</w:t>
+            </w:r>
+          </w:p>
+        </w:tc>
+        <w:tc>
+          <w:tcPr>
+            <w:tcW w:type="dxa" w:w="2160"/>
+          </w:tcPr>
+          <w:p>
+            <w:r>
+              <w:t xml:space="preserve">Acciones A1, A2</w:t>
+            </w:r>
+          </w:p>
+        </w:tc>
+        <w:tc>
+          <w:tcPr>
+            <w:tcW w:type="dxa" w:w="2160"/>
+          </w:tcPr>
+          <w:p>
+            <w:r>
+              <w:t xml:space="preserve">Cubierto</w:t>
+            </w:r>
+          </w:p>
+        </w:tc>
+      </w:tr>
+      <w:tr>
+        <w:tc>
+          <w:tcPr>
+            <w:tcW w:type="dxa" w:w="2160"/>
+          </w:tcPr>
+          <w:p>
+            <w:r>
+              <w:t xml:space="preserve">Público</w:t>
+            </w:r>
+          </w:p>
+        </w:tc>
+        <w:tc>
+          <w:tcPr>
+            <w:tcW w:type="dxa" w:w="2160"/>
+          </w:tcPr>
+          <w:p>
+            <w:r>
+              <w:t xml:space="preserve">Profesionales con requisitos específicos (pilotos)</w:t>
+            </w:r>
+          </w:p>
+        </w:tc>
+        <w:tc>
+          <w:tcPr>
+            <w:tcW w:type="dxa" w:w="2160"/>
+          </w:tcPr>
+          <w:p>
+            <w:r>
+              <w:t xml:space="preserve">pendiente: Ninguna acción ni hallazgo de la propuesta lo trata.</w:t>
+            </w:r>
+          </w:p>
+        </w:tc>
+        <w:tc>
+          <w:tcPr>
+            <w:tcW w:type="dxa" w:w="2160"/>
+          </w:tcPr>
+          <w:p>
+            <w:r>
+              <w:t xml:space="preserve">Pendiente</w:t>
+            </w:r>
+          </w:p>
+        </w:tc>
+      </w:tr>
+      <w:tr>
+        <w:tc>
+          <w:tcPr>
+            <w:tcW w:type="dxa" w:w="2160"/>
+          </w:tcPr>
+          <w:p>
+            <w:r>
+              <w:t xml:space="preserve">Competidor declarado</w:t>
+            </w:r>
+          </w:p>
+        </w:tc>
+        <w:tc>
+          <w:tcPr>
+            <w:tcW w:type="dxa" w:w="2160"/>
+          </w:tcPr>
+          <w:p>
+            <w:r>
+              <w:t xml:space="preserve">Instituto Oftálmico Tramuntana</w:t>
+            </w:r>
+          </w:p>
+        </w:tc>
+        <w:tc>
+          <w:tcPr>
+            <w:tcW w:type="dxa" w:w="2160"/>
+          </w:tcPr>
+          <w:p>
+            <w:r>
+              <w:t xml:space="preserve">Acciones A1, A2</w:t>
+            </w:r>
+          </w:p>
+        </w:tc>
+        <w:tc>
+          <w:tcPr>
+            <w:tcW w:type="dxa" w:w="2160"/>
+          </w:tcPr>
+          <w:p>
+            <w:r>
+              <w:t xml:space="preserve">Cubierto</w:t>
+            </w:r>
+          </w:p>
+        </w:tc>
+      </w:tr>
+      <w:tr>
+        <w:tc>
+          <w:tcPr>
+            <w:tcW w:type="dxa" w:w="2160"/>
+          </w:tcPr>
+          <w:p>
+            <w:r>
+              <w:t xml:space="preserve">Competidor declarado</w:t>
+            </w:r>
+          </w:p>
+        </w:tc>
+        <w:tc>
+          <w:tcPr>
+            <w:tcW w:type="dxa" w:w="2160"/>
+          </w:tcPr>
+          <w:p>
+            <w:r>
+              <w:t xml:space="preserve">Láser Nítida</w:t>
+            </w:r>
+          </w:p>
+        </w:tc>
+        <w:tc>
+          <w:tcPr>
+            <w:tcW w:type="dxa" w:w="2160"/>
+          </w:tcPr>
+          <w:p>
+            <w:r>
+              <w:t xml:space="preserve">Acciones A1, A2</w:t>
+            </w:r>
+          </w:p>
+        </w:tc>
+        <w:tc>
+          <w:tcPr>
+            <w:tcW w:type="dxa" w:w="2160"/>
+          </w:tcPr>
+          <w:p>
+            <w:r>
+              <w:t xml:space="preserve">Cubierto</w:t>
+            </w:r>
+          </w:p>
+        </w:tc>
+      </w:tr>
+      <w:tr>
+        <w:tc>
+          <w:tcPr>
+            <w:tcW w:type="dxa" w:w="2160"/>
+          </w:tcPr>
+          <w:p>
+            <w:r>
+              <w:t xml:space="preserve">Competidor declarado</w:t>
+            </w:r>
+          </w:p>
+        </w:tc>
+        <w:tc>
+          <w:tcPr>
+            <w:tcW w:type="dxa" w:w="2160"/>
+          </w:tcPr>
+          <w:p>
+            <w:r>
+              <w:t xml:space="preserve">Grupo Hospitalario Valdecruz</w:t>
+            </w:r>
+          </w:p>
+        </w:tc>
+        <w:tc>
+          <w:tcPr>
+            <w:tcW w:type="dxa" w:w="2160"/>
+          </w:tcPr>
+          <w:p>
+            <w:r>
+              <w:t xml:space="preserve">Acciones A1, A2</w:t>
+            </w:r>
+          </w:p>
+        </w:tc>
+        <w:tc>
+          <w:tcPr>
+            <w:tcW w:type="dxa" w:w="2160"/>
+          </w:tcPr>
+          <w:p>
+            <w:r>
+              <w:t xml:space="preserve">Cubierto</w:t>
+            </w:r>
+          </w:p>
+        </w:tc>
+      </w:tr>
+      <w:tr>
+        <w:tc>
+          <w:tcPr>
+            <w:tcW w:type="dxa" w:w="2160"/>
+          </w:tcPr>
+          <w:p>
+            <w:r>
+              <w:t xml:space="preserve">Presupuesto</w:t>
+            </w:r>
+          </w:p>
+        </w:tc>
+        <w:tc>
+          <w:tcPr>
+            <w:tcW w:type="dxa" w:w="2160"/>
+          </w:tcPr>
+          <w:p>
+            <w:r>
+              <w:t xml:space="preserve">18.000–27.000 € al año</w:t>
+            </w:r>
+          </w:p>
+        </w:tc>
+        <w:tc>
+          <w:tcPr>
+            <w:tcW w:type="dxa" w:w="2160"/>
+          </w:tcPr>
+          <w:p>
+            <w:r>
+              <w:t xml:space="preserve">Plan de 22.000 €, dentro del máximo de 27.000 €.</w:t>
+            </w:r>
+          </w:p>
+        </w:tc>
+        <w:tc>
+          <w:tcPr>
+            <w:tcW w:type="dxa" w:w="2160"/>
+          </w:tcPr>
+          <w:p>
+            <w:r>
+              <w:t xml:space="preserve">Cubierto</w:t>
+            </w:r>
+          </w:p>
+        </w:tc>
+      </w:tr>
+    </w:tbl>
+    <w:p/>
+    <w:p>
+      <w:pPr>
+        <w:pStyle w:val="Heading1"/>
+      </w:pPr>
+      <w:r>
+        <w:t>3. Contexto y alcance</w:t>
       </w:r>
     </w:p>
     <w:tbl>
@@ -257,7 +1190,7 @@
         <w:pStyle w:val="Heading1"/>
       </w:pPr>
       <w:r>
-        <w:t>3. Diagnóstico de visibilidad</w:t>
+        <w:t>4. Diagnóstico de visibilidad</w:t>
       </w:r>
     </w:p>
     <w:p>
@@ -2309,7 +3242,7 @@
         <w:pStyle w:val="Heading1"/>
       </w:pPr>
       <w:r>
-        <w:t>4. Análisis de la competencia</w:t>
+        <w:t>5. Análisis de la competencia</w:t>
       </w:r>
     </w:p>
     <w:p>
@@ -4380,7 +5313,7 @@
         <w:pStyle w:val="Heading1"/>
       </w:pPr>
       <w:r>
-        <w:t>5. Hallazgos clave</w:t>
+        <w:t>6. Hallazgos clave</w:t>
       </w:r>
     </w:p>
     <w:p>
@@ -5487,7 +6420,7 @@
         <w:pStyle w:val="Heading1"/>
       </w:pPr>
       <w:r>
-        <w:t>6. Estrategia recomendada</w:t>
+        <w:t>7. Estrategia recomendada</w:t>
       </w:r>
     </w:p>
     <w:p>
@@ -5630,7 +6563,7 @@
         <w:pStyle w:val="Heading1"/>
       </w:pPr>
       <w:r>
-        <w:t>7. Plan de acción por fases</w:t>
+        <w:t>8. Plan de acción por fases</w:t>
       </w:r>
     </w:p>
     <w:tbl>
@@ -6244,7 +7177,7 @@
         <w:pStyle w:val="Heading1"/>
       </w:pPr>
       <w:r>
-        <w:t>8. Medición y seguimiento</w:t>
+        <w:t>9. Medición y seguimiento</w:t>
       </w:r>
     </w:p>
     <w:p>
@@ -6332,7 +7265,7 @@
         <w:pStyle w:val="Heading1"/>
       </w:pPr>
       <w:r>
-        <w:t>9. Riesgos y supuestos</w:t>
+        <w:t>10. Riesgos y supuestos</w:t>
       </w:r>
     </w:p>
     <w:tbl>
@@ -6396,7 +7329,7 @@
         <w:pStyle w:val="Heading1"/>
       </w:pPr>
       <w:r>
-        <w:t>10. Hoja de ruta y presupuesto</w:t>
+        <w:t>11. Hoja de ruta y presupuesto</w:t>
       </w:r>
     </w:p>
     <w:p>

</xml_diff>